<commit_message>
Fixed the pdf document, fixed uml and added task 2
</commit_message>
<xml_diff>
--- a/Prac3-pdf.docx
+++ b/Prac3-pdf.docx
@@ -36,147 +36,93 @@
         <w:t xml:space="preserve"> </w:t>
       </w:r>
       <w:r>
-        <w:t>Sonic Horizons Festival. This is a large outdoor festival that’s hosts live performances, food vendors and multiple types of operational services. This festival is divided into several operational areas that work together to provide entertainment, safety and top-notch services. Event organisers should be able to coordinate these areas effectively, especially when responding to weather conditions, capacity limits as well as emergency situations. We have made use of hierarchies so that the entire area can be manged uniformly. This will allow the festival management to perform operations on a complete section without needing to interact directly with every unit.</w:t>
+        <w:t>Sonic Horizons Festival. This is a large outdoor festival that hosts live performances, food vendors and multiple types of operational services. This festival is divided into several operational areas that work together to provide entertainment, safety and top-notch services. Event organisers should be able to coordinate these areas effectively, especially when responding to weather conditions, capacity limits as well as emergency situations. We have made use of hierarchies so that the entire area can be manged uniformly. This will allow the festival management to perform operations on a complete section without needing to interact directly with every unit.</w:t>
       </w:r>
     </w:p>
     <w:p>
       <w:pPr>
         <w:pStyle w:val="ListParagraph"/>
-      </w:pPr>
-      <w:r>
-        <w:rPr>
-          <w:b/>
-          <w:bCs/>
-        </w:rPr>
-        <w:t>Group Area</w:t>
-      </w:r>
-      <w:r>
-        <w:rPr>
-          <w:b/>
-          <w:bCs/>
-        </w:rPr>
+        <w:rPr>
+          <w:b/>
+          <w:bCs/>
+        </w:rPr>
+      </w:pPr>
+    </w:p>
+    <w:p>
+      <w:pPr>
+        <w:pStyle w:val="ListParagraph"/>
+        <w:rPr>
+          <w:b/>
+          <w:bCs/>
+        </w:rPr>
+      </w:pPr>
+      <w:r>
+        <w:rPr>
+          <w:b/>
+          <w:bCs/>
+        </w:rPr>
+        <w:t>Event Structure</w:t>
+      </w:r>
+    </w:p>
+    <w:p>
+      <w:pPr>
+        <w:rPr>
+          <w:b/>
+          <w:bCs/>
+        </w:rPr>
+      </w:pPr>
+      <w:r>
+        <w:rPr>
+          <w:b/>
+          <w:bCs/>
+        </w:rPr>
+        <w:tab/>
+      </w:r>
+      <w:proofErr w:type="spellStart"/>
+      <w:r>
+        <w:t>SonicHorizonsFestival</w:t>
+      </w:r>
+      <w:proofErr w:type="spellEnd"/>
+    </w:p>
+    <w:p>
+      <w:pPr>
+        <w:ind w:firstLine="720"/>
+        <w:rPr>
+          <w:b/>
+          <w:bCs/>
+        </w:rPr>
+      </w:pPr>
+      <w:r>
+        <w:rPr>
+          <w:b/>
+          <w:bCs/>
+        </w:rPr>
+        <w:t>|</w:t>
+      </w:r>
+    </w:p>
+    <w:p>
+      <w:pPr>
+        <w:ind w:firstLine="720"/>
+        <w:rPr>
+          <w:b/>
+          <w:bCs/>
+        </w:rPr>
+      </w:pPr>
+      <w:r>
+        <w:rPr>
+          <w:b/>
+          <w:bCs/>
+        </w:rPr>
+        <w:t>|-----</w:t>
+      </w:r>
+      <w:r>
         <w:t xml:space="preserve"> </w:t>
       </w:r>
-      <w:r>
-        <w:rPr>
-          <w:b/>
-          <w:bCs/>
-        </w:rPr>
-        <w:t xml:space="preserve">(Composite Classes): </w:t>
-      </w:r>
-      <w:r>
-        <w:t>SonicHorizonsFestival, PerformanceZone, MainStageArea, ElectronicStageArea, FoodCourt, OperationsZone</w:t>
-      </w:r>
-      <w:r>
-        <w:t xml:space="preserve">. </w:t>
-      </w:r>
-    </w:p>
-    <w:p>
-      <w:pPr>
-        <w:pStyle w:val="ListParagraph"/>
-      </w:pPr>
-      <w:r>
-        <w:rPr>
-          <w:b/>
-          <w:bCs/>
-        </w:rPr>
-        <w:t>Oper</w:t>
-      </w:r>
-      <w:r>
-        <w:rPr>
-          <w:b/>
-          <w:bCs/>
-        </w:rPr>
-        <w:t>atio</w:t>
-      </w:r>
-      <w:r>
-        <w:rPr>
-          <w:b/>
-          <w:bCs/>
-        </w:rPr>
-        <w:t xml:space="preserve">nalUnits (LeafClasses):  </w:t>
-      </w:r>
-      <w:r>
-        <w:t>MainStage, BackStage, DjStage, DanceFloor, BurgerVendor, BeverageVendor, SecurityPost, FirstAidTent.</w:t>
-      </w:r>
-    </w:p>
-    <w:p>
-      <w:pPr>
-        <w:pStyle w:val="ListParagraph"/>
-        <w:rPr>
-          <w:b/>
-          <w:bCs/>
-        </w:rPr>
-      </w:pPr>
-    </w:p>
-    <w:p>
-      <w:pPr>
-        <w:pStyle w:val="ListParagraph"/>
-        <w:rPr>
-          <w:b/>
-          <w:bCs/>
-        </w:rPr>
-      </w:pPr>
-      <w:r>
-        <w:rPr>
-          <w:b/>
-          <w:bCs/>
-        </w:rPr>
-        <w:t>Event Structure</w:t>
-      </w:r>
-    </w:p>
-    <w:p>
-      <w:pPr>
-        <w:rPr>
-          <w:b/>
-          <w:bCs/>
-        </w:rPr>
-      </w:pPr>
-      <w:r>
-        <w:rPr>
-          <w:b/>
-          <w:bCs/>
-        </w:rPr>
-        <w:tab/>
-      </w:r>
-      <w:r>
-        <w:t>SonicHorizonsFestival</w:t>
-      </w:r>
-    </w:p>
-    <w:p>
-      <w:pPr>
-        <w:ind w:firstLine="720"/>
-        <w:rPr>
-          <w:b/>
-          <w:bCs/>
-        </w:rPr>
-      </w:pPr>
-      <w:r>
-        <w:rPr>
-          <w:b/>
-          <w:bCs/>
-        </w:rPr>
-        <w:t>|</w:t>
-      </w:r>
-    </w:p>
-    <w:p>
-      <w:pPr>
-        <w:ind w:firstLine="720"/>
-        <w:rPr>
-          <w:b/>
-          <w:bCs/>
-        </w:rPr>
-      </w:pPr>
-      <w:r>
-        <w:rPr>
-          <w:b/>
-          <w:bCs/>
-        </w:rPr>
-        <w:t>|-----</w:t>
-      </w:r>
-      <w:r>
-        <w:t xml:space="preserve"> PerformanceZone</w:t>
-      </w:r>
+      <w:proofErr w:type="spellStart"/>
+      <w:r>
+        <w:t>PerformanceZone</w:t>
+      </w:r>
+      <w:proofErr w:type="spellEnd"/>
     </w:p>
     <w:p>
       <w:pPr>
@@ -203,9 +149,11 @@
       <w:r>
         <w:t xml:space="preserve"> </w:t>
       </w:r>
+      <w:proofErr w:type="spellStart"/>
       <w:r>
         <w:t>MainStageArea</w:t>
       </w:r>
+      <w:proofErr w:type="spellEnd"/>
     </w:p>
     <w:p>
       <w:pPr>
@@ -232,9 +180,11 @@
       <w:r>
         <w:t xml:space="preserve"> </w:t>
       </w:r>
+      <w:proofErr w:type="spellStart"/>
       <w:r>
         <w:t>MainStage</w:t>
       </w:r>
+      <w:proofErr w:type="spellEnd"/>
     </w:p>
     <w:p>
       <w:pPr>
@@ -261,9 +211,89 @@
       <w:r>
         <w:t xml:space="preserve"> </w:t>
       </w:r>
+      <w:proofErr w:type="spellStart"/>
       <w:r>
         <w:t>BackStage</w:t>
       </w:r>
+      <w:proofErr w:type="spellEnd"/>
+    </w:p>
+    <w:p>
+      <w:pPr>
+        <w:rPr>
+          <w:b/>
+          <w:bCs/>
+        </w:rPr>
+      </w:pPr>
+      <w:r>
+        <w:rPr>
+          <w:b/>
+          <w:bCs/>
+        </w:rPr>
+        <w:tab/>
+        <w:t>|         |----</w:t>
+      </w:r>
+      <w:r>
+        <w:t xml:space="preserve"> </w:t>
+      </w:r>
+      <w:proofErr w:type="spellStart"/>
+      <w:r>
+        <w:t>Electronic</w:t>
+      </w:r>
+      <w:r>
+        <w:t>StageArea</w:t>
+      </w:r>
+      <w:proofErr w:type="spellEnd"/>
+    </w:p>
+    <w:p>
+      <w:pPr>
+        <w:rPr>
+          <w:b/>
+          <w:bCs/>
+        </w:rPr>
+      </w:pPr>
+      <w:r>
+        <w:rPr>
+          <w:b/>
+          <w:bCs/>
+        </w:rPr>
+        <w:tab/>
+        <w:t>|                 |----</w:t>
+      </w:r>
+      <w:r>
+        <w:t xml:space="preserve"> </w:t>
+      </w:r>
+      <w:proofErr w:type="spellStart"/>
+      <w:r>
+        <w:t>Dj</w:t>
+      </w:r>
+      <w:r>
+        <w:t>Stage</w:t>
+      </w:r>
+      <w:proofErr w:type="spellEnd"/>
+    </w:p>
+    <w:p>
+      <w:pPr>
+        <w:rPr>
+          <w:b/>
+          <w:bCs/>
+        </w:rPr>
+      </w:pPr>
+      <w:r>
+        <w:rPr>
+          <w:b/>
+          <w:bCs/>
+        </w:rPr>
+        <w:tab/>
+        <w:t>|                 |----</w:t>
+      </w:r>
+      <w:r>
+        <w:t xml:space="preserve"> </w:t>
+      </w:r>
+      <w:proofErr w:type="spellStart"/>
+      <w:r>
+        <w:t>DanceFloor</w:t>
+      </w:r>
+      <w:proofErr w:type="spellEnd"/>
     </w:p>
     <w:p>
       <w:pPr>
@@ -287,9 +317,11 @@
         </w:rPr>
         <w:t xml:space="preserve">--- </w:t>
       </w:r>
+      <w:proofErr w:type="spellStart"/>
       <w:r>
         <w:t>FoodCourt</w:t>
       </w:r>
+      <w:proofErr w:type="spellEnd"/>
     </w:p>
     <w:p>
       <w:pPr>
@@ -314,8 +346,13 @@
         <w:t xml:space="preserve">      |---</w:t>
       </w:r>
       <w:r>
-        <w:t xml:space="preserve"> BurgerVendor</w:t>
-      </w:r>
+        <w:t xml:space="preserve"> </w:t>
+      </w:r>
+      <w:proofErr w:type="spellStart"/>
+      <w:r>
+        <w:t>BurgerVendor</w:t>
+      </w:r>
+      <w:proofErr w:type="spellEnd"/>
     </w:p>
     <w:p>
       <w:pPr>
@@ -339,9 +376,77 @@
         </w:rPr>
         <w:t xml:space="preserve">      |--- </w:t>
       </w:r>
+      <w:proofErr w:type="spellStart"/>
       <w:r>
         <w:t>BeverageVendor</w:t>
       </w:r>
+      <w:proofErr w:type="spellEnd"/>
+    </w:p>
+    <w:p>
+      <w:pPr>
+        <w:ind w:firstLine="720"/>
+        <w:rPr>
+          <w:b/>
+          <w:bCs/>
+        </w:rPr>
+      </w:pPr>
+      <w:r>
+        <w:rPr>
+          <w:b/>
+          <w:bCs/>
+        </w:rPr>
+        <w:t xml:space="preserve">|--- </w:t>
+      </w:r>
+      <w:proofErr w:type="spellStart"/>
+      <w:r>
+        <w:t>OperationsZone</w:t>
+      </w:r>
+      <w:proofErr w:type="spellEnd"/>
+    </w:p>
+    <w:p>
+      <w:pPr>
+        <w:rPr>
+          <w:b/>
+          <w:bCs/>
+        </w:rPr>
+      </w:pPr>
+      <w:r>
+        <w:rPr>
+          <w:b/>
+          <w:bCs/>
+        </w:rPr>
+        <w:tab/>
+        <w:t>|      |---</w:t>
+      </w:r>
+      <w:r>
+        <w:t xml:space="preserve"> </w:t>
+      </w:r>
+      <w:proofErr w:type="spellStart"/>
+      <w:r>
+        <w:t>SecurityPost</w:t>
+      </w:r>
+      <w:proofErr w:type="spellEnd"/>
+    </w:p>
+    <w:p>
+      <w:pPr>
+        <w:rPr>
+          <w:b/>
+          <w:bCs/>
+        </w:rPr>
+      </w:pPr>
+      <w:r>
+        <w:rPr>
+          <w:b/>
+          <w:bCs/>
+        </w:rPr>
+        <w:tab/>
+        <w:t xml:space="preserve">|      |--- </w:t>
+      </w:r>
+      <w:proofErr w:type="spellStart"/>
+      <w:r>
+        <w:t>FirstAidTent</w:t>
+      </w:r>
+      <w:proofErr w:type="spellEnd"/>
     </w:p>
     <w:p>
       <w:pPr>
@@ -358,6 +463,14 @@
         <w:tab/>
         <w:t>|</w:t>
       </w:r>
+    </w:p>
+    <w:p>
+      <w:pPr>
+        <w:rPr>
+          <w:b/>
+          <w:bCs/>
+        </w:rPr>
+      </w:pPr>
     </w:p>
     <w:p>
       <w:pPr>
@@ -407,6 +520,7 @@
           <w:b/>
           <w:bCs/>
         </w:rPr>
+        <w:lastRenderedPageBreak/>
         <w:t>Subject:</w:t>
       </w:r>
       <w:r>
@@ -416,24 +530,35 @@
         </w:rPr>
         <w:t xml:space="preserve"> </w:t>
       </w:r>
+      <w:proofErr w:type="spellStart"/>
       <w:r>
         <w:t>Festival</w:t>
       </w:r>
       <w:r>
         <w:t>Subject</w:t>
       </w:r>
+      <w:proofErr w:type="spellEnd"/>
     </w:p>
     <w:p>
       <w:pPr>
         <w:pStyle w:val="ListParagraph"/>
         <w:ind w:left="1440"/>
       </w:pPr>
-      <w:r>
-        <w:rPr>
-          <w:b/>
-          <w:bCs/>
-        </w:rPr>
-        <w:t>ConcreteSubject:</w:t>
+      <w:proofErr w:type="spellStart"/>
+      <w:r>
+        <w:rPr>
+          <w:b/>
+          <w:bCs/>
+        </w:rPr>
+        <w:t>ConcreteSubject</w:t>
+      </w:r>
+      <w:proofErr w:type="spellEnd"/>
+      <w:r>
+        <w:rPr>
+          <w:b/>
+          <w:bCs/>
+        </w:rPr>
+        <w:t>:</w:t>
       </w:r>
       <w:r>
         <w:rPr>
@@ -442,12 +567,22 @@
         </w:rPr>
         <w:t xml:space="preserve"> </w:t>
       </w:r>
+      <w:proofErr w:type="spellStart"/>
       <w:r>
         <w:t>Festival</w:t>
       </w:r>
       <w:r>
-        <w:t>Control, FestivalGroup</w:t>
-      </w:r>
+        <w:t>Control</w:t>
+      </w:r>
+      <w:proofErr w:type="spellEnd"/>
+      <w:r>
+        <w:t xml:space="preserve">, </w:t>
+      </w:r>
+      <w:proofErr w:type="spellStart"/>
+      <w:r>
+        <w:t>FestivalGroup</w:t>
+      </w:r>
+      <w:proofErr w:type="spellEnd"/>
       <w:r>
         <w:t xml:space="preserve"> </w:t>
       </w:r>
@@ -471,9 +606,11 @@
         </w:rPr>
         <w:t xml:space="preserve"> </w:t>
       </w:r>
+      <w:proofErr w:type="spellStart"/>
       <w:r>
         <w:t>FestivalObserver</w:t>
       </w:r>
+      <w:proofErr w:type="spellEnd"/>
       <w:r>
         <w:t>,</w:t>
       </w:r>
@@ -483,12 +620,21 @@
         <w:pStyle w:val="ListParagraph"/>
         <w:ind w:left="1440"/>
       </w:pPr>
-      <w:r>
-        <w:rPr>
-          <w:b/>
-          <w:bCs/>
-        </w:rPr>
-        <w:t>ConcreteObserver:</w:t>
+      <w:proofErr w:type="spellStart"/>
+      <w:r>
+        <w:rPr>
+          <w:b/>
+          <w:bCs/>
+        </w:rPr>
+        <w:t>ConcreteObserver</w:t>
+      </w:r>
+      <w:proofErr w:type="spellEnd"/>
+      <w:r>
+        <w:rPr>
+          <w:b/>
+          <w:bCs/>
+        </w:rPr>
+        <w:t>:</w:t>
       </w:r>
       <w:r>
         <w:rPr>
@@ -497,9 +643,12 @@
         </w:rPr>
         <w:t xml:space="preserve"> </w:t>
       </w:r>
+      <w:proofErr w:type="spellStart"/>
+      <w:proofErr w:type="gramStart"/>
       <w:r>
         <w:t>FestivalUnit</w:t>
       </w:r>
+      <w:proofErr w:type="spellEnd"/>
       <w:r>
         <w:t xml:space="preserve">, </w:t>
       </w:r>
@@ -510,9 +659,12 @@
         </w:rPr>
         <w:t xml:space="preserve"> </w:t>
       </w:r>
+      <w:proofErr w:type="spellStart"/>
       <w:r>
         <w:t>FestivalGroup</w:t>
       </w:r>
+      <w:proofErr w:type="spellEnd"/>
+      <w:proofErr w:type="gramEnd"/>
       <w:r>
         <w:t xml:space="preserve"> </w:t>
       </w:r>
@@ -528,12 +680,29 @@
         <w:pStyle w:val="ListParagraph"/>
         <w:ind w:left="1440"/>
       </w:pPr>
-      <w:r>
-        <w:t xml:space="preserve">FestivalControl generates notices and distributes them through the Observer pattern. FestivalGroup objects receive notices from parent </w:t>
-      </w:r>
-      <w:r>
-        <w:lastRenderedPageBreak/>
-        <w:t>subjects and forward them to lower-level observers. FestivalUnit objects receive notices and react according to their individual responsibilities.</w:t>
+      <w:proofErr w:type="spellStart"/>
+      <w:r>
+        <w:t>FestivalControl</w:t>
+      </w:r>
+      <w:proofErr w:type="spellEnd"/>
+      <w:r>
+        <w:t xml:space="preserve"> generates notices and distributes them through the Observer pattern. </w:t>
+      </w:r>
+      <w:proofErr w:type="spellStart"/>
+      <w:r>
+        <w:t>FestivalGroup</w:t>
+      </w:r>
+      <w:proofErr w:type="spellEnd"/>
+      <w:r>
+        <w:t xml:space="preserve"> objects receive notices from parent subjects and forward them to lower-level observers. </w:t>
+      </w:r>
+      <w:proofErr w:type="spellStart"/>
+      <w:r>
+        <w:t>FestivalUnit</w:t>
+      </w:r>
+      <w:proofErr w:type="spellEnd"/>
+      <w:r>
+        <w:t xml:space="preserve"> objects receive notices and react according to their individual responsibilities.</w:t>
       </w:r>
     </w:p>
     <w:p>
@@ -580,9 +749,11 @@
         <w:tab/>
         <w:t xml:space="preserve">Component: </w:t>
       </w:r>
+      <w:proofErr w:type="spellStart"/>
       <w:r>
         <w:t>FestivalComponent</w:t>
       </w:r>
+      <w:proofErr w:type="spellEnd"/>
     </w:p>
     <w:p>
       <w:pPr>
@@ -595,13 +766,19 @@
         </w:rPr>
         <w:t xml:space="preserve">Leaf: </w:t>
       </w:r>
+      <w:proofErr w:type="spellStart"/>
       <w:r>
         <w:t>FestivalUnit</w:t>
       </w:r>
+      <w:proofErr w:type="spellEnd"/>
     </w:p>
     <w:p>
       <w:pPr>
         <w:ind w:left="720" w:firstLine="720"/>
+        <w:rPr>
+          <w:b/>
+          <w:bCs/>
+        </w:rPr>
       </w:pPr>
       <w:r>
         <w:rPr>
@@ -610,84 +787,164 @@
         </w:rPr>
         <w:t xml:space="preserve">Composite: </w:t>
       </w:r>
+      <w:proofErr w:type="spellStart"/>
       <w:r>
         <w:t>FestivalGroup</w:t>
       </w:r>
+      <w:proofErr w:type="spellEnd"/>
+      <w:r>
+        <w:rPr>
+          <w:b/>
+          <w:bCs/>
+        </w:rPr>
+        <w:t xml:space="preserve"> </w:t>
+      </w:r>
     </w:p>
     <w:p>
       <w:pPr>
         <w:ind w:left="1440"/>
-        <w:rPr>
-          <w:b/>
-          <w:bCs/>
-        </w:rPr>
-      </w:pPr>
-      <w:r>
-        <w:rPr>
-          <w:b/>
-          <w:bCs/>
-        </w:rPr>
-        <w:t>Concrete</w:t>
-      </w:r>
-      <w:r>
-        <w:rPr>
-          <w:b/>
-          <w:bCs/>
-        </w:rPr>
-        <w:t xml:space="preserve">Composite: </w:t>
-      </w:r>
-      <w:r>
-        <w:t>SonicHorizonsFestival, PerformanceZone, MainStageArea, ElectronicStageArea, FoodCourt, OperationsZone</w:t>
-      </w:r>
-      <w:r>
-        <w:rPr>
-          <w:b/>
-          <w:bCs/>
-        </w:rPr>
+      </w:pPr>
+      <w:proofErr w:type="spellStart"/>
+      <w:r>
+        <w:rPr>
+          <w:b/>
+          <w:bCs/>
+        </w:rPr>
+        <w:t>Co</w:t>
+      </w:r>
+      <w:r>
+        <w:rPr>
+          <w:b/>
+          <w:bCs/>
+        </w:rPr>
+        <w:t>ncreteLeaves</w:t>
+      </w:r>
+      <w:proofErr w:type="spellEnd"/>
+      <w:r>
+        <w:rPr>
+          <w:b/>
+          <w:bCs/>
+        </w:rPr>
+        <w:t xml:space="preserve">: </w:t>
+      </w:r>
+      <w:proofErr w:type="spellStart"/>
+      <w:r>
+        <w:t>MainStage</w:t>
+      </w:r>
+      <w:proofErr w:type="spellEnd"/>
+      <w:r>
+        <w:t xml:space="preserve">, </w:t>
+      </w:r>
+      <w:proofErr w:type="spellStart"/>
+      <w:r>
+        <w:t>Back</w:t>
+      </w:r>
+      <w:r>
+        <w:t>S</w:t>
+      </w:r>
+      <w:r>
+        <w:t>tage</w:t>
+      </w:r>
+      <w:proofErr w:type="spellEnd"/>
+      <w:r>
+        <w:t xml:space="preserve">, </w:t>
+      </w:r>
+      <w:proofErr w:type="spellStart"/>
+      <w:r>
+        <w:t>DJStage</w:t>
+      </w:r>
+      <w:proofErr w:type="spellEnd"/>
+      <w:r>
+        <w:t xml:space="preserve">, </w:t>
+      </w:r>
+      <w:proofErr w:type="spellStart"/>
+      <w:r>
+        <w:t>DanceFloor</w:t>
+      </w:r>
+      <w:proofErr w:type="spellEnd"/>
+      <w:r>
+        <w:t xml:space="preserve">, </w:t>
+      </w:r>
+      <w:proofErr w:type="spellStart"/>
+      <w:r>
+        <w:t>BurgerVendor</w:t>
+      </w:r>
+      <w:proofErr w:type="spellEnd"/>
+      <w:r>
+        <w:t xml:space="preserve">, </w:t>
+      </w:r>
+      <w:proofErr w:type="spellStart"/>
+      <w:r>
+        <w:t>BeverageVendor</w:t>
+      </w:r>
+      <w:proofErr w:type="spellEnd"/>
+      <w:r>
+        <w:t xml:space="preserve">, </w:t>
+      </w:r>
+      <w:proofErr w:type="spellStart"/>
+      <w:r>
+        <w:t>SecurityPost</w:t>
+      </w:r>
+      <w:proofErr w:type="spellEnd"/>
+      <w:r>
+        <w:t xml:space="preserve">, </w:t>
+      </w:r>
+      <w:proofErr w:type="spellStart"/>
+      <w:r>
+        <w:t>FirstAidTent</w:t>
+      </w:r>
+      <w:proofErr w:type="spellEnd"/>
+    </w:p>
+    <w:p>
+      <w:pPr>
+        <w:ind w:left="1440"/>
+      </w:pPr>
+      <w:r>
+        <w:t xml:space="preserve">The Composite pattern represents the physical structure of the festival. </w:t>
+      </w:r>
+      <w:proofErr w:type="spellStart"/>
+      <w:r>
+        <w:t>FestivalGroup</w:t>
+      </w:r>
+      <w:proofErr w:type="spellEnd"/>
+      <w:r>
+        <w:t xml:space="preserve"> objects own </w:t>
+      </w:r>
+      <w:proofErr w:type="spellStart"/>
+      <w:r>
+        <w:t>FestivalComponent</w:t>
+      </w:r>
+      <w:proofErr w:type="spellEnd"/>
+      <w:r>
+        <w:t xml:space="preserve"> objects, allowing individual units and entire areas to be treated uniformly.</w:t>
+      </w:r>
+      <w:r>
         <w:t xml:space="preserve"> </w:t>
       </w:r>
-    </w:p>
-    <w:p>
-      <w:pPr>
-        <w:ind w:left="1440"/>
-      </w:pPr>
-      <w:r>
-        <w:rPr>
-          <w:b/>
-          <w:bCs/>
-        </w:rPr>
-        <w:t>Co</w:t>
-      </w:r>
-      <w:r>
-        <w:rPr>
-          <w:b/>
-          <w:bCs/>
-        </w:rPr>
-        <w:t>ncreteLeaves</w:t>
-      </w:r>
-      <w:r>
-        <w:rPr>
-          <w:b/>
-          <w:bCs/>
-        </w:rPr>
-        <w:t xml:space="preserve">: </w:t>
-      </w:r>
-      <w:r>
-        <w:t>MainStage, Back</w:t>
-      </w:r>
-      <w:r>
-        <w:t>S</w:t>
-      </w:r>
-      <w:r>
-        <w:t>tage, DJStage, DanceFloor, BurgerVendor, BeverageVendor, SecurityPost, FirstAidTent</w:t>
-      </w:r>
-    </w:p>
-    <w:p>
-      <w:pPr>
-        <w:ind w:left="1440"/>
-      </w:pPr>
-      <w:r>
-        <w:t>The Composite pattern represents the physical structure of the festival. FestivalGroup objects own FestivalComponent objects, allowing individual units and entire areas to be treated uniformly.</w:t>
+      <w:proofErr w:type="spellStart"/>
+      <w:r>
+        <w:t>Festival</w:t>
+      </w:r>
+      <w:r>
+        <w:t>Group</w:t>
+      </w:r>
+      <w:proofErr w:type="spellEnd"/>
+      <w:r>
+        <w:t xml:space="preserve"> creates the instances such as food </w:t>
+      </w:r>
+      <w:proofErr w:type="gramStart"/>
+      <w:r>
+        <w:t>court ,</w:t>
+      </w:r>
+      <w:proofErr w:type="gramEnd"/>
+      <w:r>
+        <w:t xml:space="preserve"> performance zone and etc</w:t>
+      </w:r>
+      <w:r>
+        <w:t xml:space="preserve"> as they all share the same behaviours</w:t>
+      </w:r>
+      <w:r>
+        <w:t>.</w:t>
       </w:r>
     </w:p>
     <w:p>
@@ -773,38 +1030,94 @@
         <w:t xml:space="preserve">a) </w:t>
       </w:r>
       <w:r>
-        <w:t>The FestivalGroup contains FestivalComponents, which can be individual parts (Leaves) or other groups (Composites). Actions like open(), close(), and getCapacity() are passed down to its children. This lets us treat the whole festival and its individual parts in the same way.</w:t>
+        <w:t xml:space="preserve">The </w:t>
+      </w:r>
+      <w:proofErr w:type="spellStart"/>
+      <w:r>
+        <w:t>FestivalGroup</w:t>
+      </w:r>
+      <w:proofErr w:type="spellEnd"/>
+      <w:r>
+        <w:t xml:space="preserve"> contains </w:t>
+      </w:r>
+      <w:proofErr w:type="spellStart"/>
+      <w:r>
+        <w:t>FestivalComponents</w:t>
+      </w:r>
+      <w:proofErr w:type="spellEnd"/>
+      <w:r>
+        <w:t xml:space="preserve">, which can be individual parts (Leaves) or other groups (Composites). Actions like </w:t>
+      </w:r>
+      <w:proofErr w:type="gramStart"/>
+      <w:r>
+        <w:t>open(</w:t>
+      </w:r>
+      <w:proofErr w:type="gramEnd"/>
+      <w:r>
+        <w:t xml:space="preserve">), </w:t>
+      </w:r>
+      <w:proofErr w:type="gramStart"/>
+      <w:r>
+        <w:t>close(</w:t>
+      </w:r>
+      <w:proofErr w:type="gramEnd"/>
+      <w:r>
+        <w:t xml:space="preserve">), and </w:t>
+      </w:r>
+      <w:proofErr w:type="spellStart"/>
+      <w:proofErr w:type="gramStart"/>
+      <w:r>
+        <w:t>getCapacity</w:t>
+      </w:r>
+      <w:proofErr w:type="spellEnd"/>
+      <w:r>
+        <w:t>(</w:t>
+      </w:r>
+      <w:proofErr w:type="gramEnd"/>
+      <w:r>
+        <w:t>) are passed down to its children. This lets us treat the whole festival and its individual parts in the same way.</w:t>
       </w:r>
       <w:r>
         <w:t xml:space="preserve"> For example, </w:t>
       </w:r>
+      <w:proofErr w:type="spellStart"/>
       <w:r>
         <w:t>SonicHorizonsFestival</w:t>
       </w:r>
+      <w:proofErr w:type="spellEnd"/>
       <w:r>
         <w:t>-&gt;</w:t>
       </w:r>
       <w:r>
         <w:t xml:space="preserve"> </w:t>
       </w:r>
+      <w:proofErr w:type="spellStart"/>
       <w:r>
         <w:t>PerformanceZone</w:t>
       </w:r>
+      <w:proofErr w:type="spellEnd"/>
       <w:r>
         <w:t>-&gt;</w:t>
       </w:r>
       <w:r>
-        <w:t xml:space="preserve"> MainStageArea</w:t>
-      </w:r>
+        <w:t xml:space="preserve"> </w:t>
+      </w:r>
+      <w:proofErr w:type="spellStart"/>
+      <w:r>
+        <w:t>MainStageArea</w:t>
+      </w:r>
+      <w:proofErr w:type="spellEnd"/>
       <w:r>
         <w:t>-&gt;</w:t>
       </w:r>
       <w:r>
         <w:t xml:space="preserve"> </w:t>
       </w:r>
+      <w:proofErr w:type="spellStart"/>
       <w:r>
         <w:t>MainStage</w:t>
       </w:r>
+      <w:proofErr w:type="spellEnd"/>
       <w:r>
         <w:t>.</w:t>
       </w:r>
@@ -822,7 +1135,15 @@
         <w:t xml:space="preserve">b) </w:t>
       </w:r>
       <w:r>
-        <w:t>Direct calls would make FestivalControl depend on every festival unit.</w:t>
+        <w:t xml:space="preserve">Direct calls would make </w:t>
+      </w:r>
+      <w:proofErr w:type="spellStart"/>
+      <w:r>
+        <w:t>FestivalControl</w:t>
+      </w:r>
+      <w:proofErr w:type="spellEnd"/>
+      <w:r>
+        <w:t xml:space="preserve"> depend on every festival unit.</w:t>
       </w:r>
       <w:r>
         <w:t xml:space="preserve"> </w:t>
@@ -834,7 +1155,47 @@
         <w:t xml:space="preserve"> It allows for a one-to-many dependency and reduces tight coupling. </w:t>
       </w:r>
       <w:r>
-        <w:t>For example, a WEATHER_ALERT can notify the MainStage, DJStage, SecurityPost, and FirstAidTent without changing FestivalControl.</w:t>
+        <w:t xml:space="preserve">For example, a WEATHER_ALERT can notify the </w:t>
+      </w:r>
+      <w:proofErr w:type="spellStart"/>
+      <w:r>
+        <w:t>MainStage</w:t>
+      </w:r>
+      <w:proofErr w:type="spellEnd"/>
+      <w:r>
+        <w:t xml:space="preserve">, </w:t>
+      </w:r>
+      <w:proofErr w:type="spellStart"/>
+      <w:r>
+        <w:t>DJStage</w:t>
+      </w:r>
+      <w:proofErr w:type="spellEnd"/>
+      <w:r>
+        <w:t xml:space="preserve">, </w:t>
+      </w:r>
+      <w:proofErr w:type="spellStart"/>
+      <w:r>
+        <w:t>SecurityPost</w:t>
+      </w:r>
+      <w:proofErr w:type="spellEnd"/>
+      <w:r>
+        <w:t xml:space="preserve">, and </w:t>
+      </w:r>
+      <w:proofErr w:type="spellStart"/>
+      <w:r>
+        <w:t>FirstAidTent</w:t>
+      </w:r>
+      <w:proofErr w:type="spellEnd"/>
+      <w:r>
+        <w:t xml:space="preserve"> without changing </w:t>
+      </w:r>
+      <w:proofErr w:type="spellStart"/>
+      <w:r>
+        <w:t>FestivalControl</w:t>
+      </w:r>
+      <w:proofErr w:type="spellEnd"/>
+      <w:r>
+        <w:t>.</w:t>
       </w:r>
     </w:p>
     <w:p>
@@ -850,11 +1211,29 @@
         <w:t xml:space="preserve">c) </w:t>
       </w:r>
       <w:r>
-        <w:t>Event components are owned exclusively by the FestivalGroup (Composite) that contains them. The root FestivalGroup (</w:t>
-      </w:r>
+        <w:t>Event components are owned exclusively by the </w:t>
+      </w:r>
+      <w:proofErr w:type="spellStart"/>
+      <w:r>
+        <w:t>FestivalGroup</w:t>
+      </w:r>
+      <w:proofErr w:type="spellEnd"/>
+      <w:r>
+        <w:t> (Composite) that contains them. The root </w:t>
+      </w:r>
+      <w:proofErr w:type="spellStart"/>
+      <w:r>
+        <w:t>FestivalGroup</w:t>
+      </w:r>
+      <w:proofErr w:type="spellEnd"/>
+      <w:r>
+        <w:t> (</w:t>
+      </w:r>
+      <w:proofErr w:type="spellStart"/>
       <w:r>
         <w:t>SonicHorizonsFestival</w:t>
       </w:r>
+      <w:proofErr w:type="spellEnd"/>
       <w:r>
         <w:t xml:space="preserve">) </w:t>
       </w:r>
@@ -884,13 +1263,29 @@
         <w:t xml:space="preserve"> a</w:t>
       </w:r>
       <w:r>
-        <w:t> FestivalSubject's observer</w:t>
+        <w:t> </w:t>
+      </w:r>
+      <w:proofErr w:type="spellStart"/>
+      <w:r>
+        <w:t>FestivalSubject's</w:t>
+      </w:r>
+      <w:proofErr w:type="spellEnd"/>
+      <w:r>
+        <w:t> observer</w:t>
       </w:r>
       <w:r>
         <w:t>’</w:t>
       </w:r>
       <w:r>
-        <w:t>s vector are raw pointers (non-owning). The subject only uses them to call update(). The observer's lifetime is managed by its owner in the Composite tree. This separation is vital: it prevents the Subject from accidentally deleting an object that is also owned by its parent, which would lead to a double-deletion bug.</w:t>
+        <w:t>s vector are raw pointers (non-owning). The subject only uses them to call </w:t>
+      </w:r>
+      <w:proofErr w:type="gramStart"/>
+      <w:r>
+        <w:t>update(</w:t>
+      </w:r>
+      <w:proofErr w:type="gramEnd"/>
+      <w:r>
+        <w:t>). The observer's lifetime is managed by its owner in the Composite tree. This separation is vital: it prevents the Subject from accidentally deleting an object that is also owned by its parent, which would lead to a double-deletion bug.</w:t>
       </w:r>
     </w:p>
     <w:p>
@@ -906,7 +1301,15 @@
         <w:t xml:space="preserve">e) </w:t>
       </w:r>
       <w:r>
-        <w:t>A FestivalGroup can be both a Subject and an Observer because it uses each role for a different purpose.</w:t>
+        <w:t xml:space="preserve">A </w:t>
+      </w:r>
+      <w:proofErr w:type="spellStart"/>
+      <w:r>
+        <w:t>FestivalGroup</w:t>
+      </w:r>
+      <w:proofErr w:type="spellEnd"/>
+      <w:r>
+        <w:t xml:space="preserve"> can be both a Subject and an Observer because it uses each role for a different purpose.</w:t>
       </w:r>
       <w:r>
         <w:t xml:space="preserve"> </w:t>
@@ -920,7 +1323,31 @@
         <w:pStyle w:val="ListParagraph"/>
       </w:pPr>
       <w:r>
-        <w:t>For example, MainStageArea receives a notice from PerformanceZone and then forwards it to MainStage and Backstage.</w:t>
+        <w:t xml:space="preserve">For example, </w:t>
+      </w:r>
+      <w:proofErr w:type="spellStart"/>
+      <w:r>
+        <w:t>MainStageArea</w:t>
+      </w:r>
+      <w:proofErr w:type="spellEnd"/>
+      <w:r>
+        <w:t xml:space="preserve"> receives a notice from </w:t>
+      </w:r>
+      <w:proofErr w:type="spellStart"/>
+      <w:r>
+        <w:t>PerformanceZone</w:t>
+      </w:r>
+      <w:proofErr w:type="spellEnd"/>
+      <w:r>
+        <w:t xml:space="preserve"> and then forwards it to </w:t>
+      </w:r>
+      <w:proofErr w:type="spellStart"/>
+      <w:r>
+        <w:t>MainStage</w:t>
+      </w:r>
+      <w:proofErr w:type="spellEnd"/>
+      <w:r>
+        <w:t xml:space="preserve"> and Backstage.</w:t>
       </w:r>
       <w:r>
         <w:t xml:space="preserve"> </w:t>
@@ -941,6 +1368,174 @@
         <w:t>.</w:t>
       </w:r>
     </w:p>
+    <w:p>
+      <w:pPr>
+        <w:pStyle w:val="ListParagraph"/>
+      </w:pPr>
+    </w:p>
+    <w:p>
+      <w:r>
+        <w:br w:type="page"/>
+      </w:r>
+    </w:p>
+    <w:p>
+      <w:pPr>
+        <w:rPr>
+          <w:sz w:val="36"/>
+          <w:szCs w:val="36"/>
+        </w:rPr>
+      </w:pPr>
+      <w:r>
+        <w:rPr>
+          <w:sz w:val="36"/>
+          <w:szCs w:val="36"/>
+        </w:rPr>
+        <w:lastRenderedPageBreak/>
+        <w:t>Task</w:t>
+      </w:r>
+      <w:r>
+        <w:rPr>
+          <w:sz w:val="36"/>
+          <w:szCs w:val="36"/>
+        </w:rPr>
+        <w:t xml:space="preserve"> 2</w:t>
+      </w:r>
+    </w:p>
+    <w:p>
+      <w:r>
+        <w:t>2.</w:t>
+      </w:r>
+      <w:r>
+        <w:t>3</w:t>
+      </w:r>
+      <w:r>
+        <w:t xml:space="preserve"> </w:t>
+      </w:r>
+    </w:p>
+    <w:p>
+      <w:r>
+        <w:rPr>
+          <w:noProof/>
+        </w:rPr>
+        <w:drawing>
+          <wp:inline distT="0" distB="0" distL="0" distR="0" wp14:anchorId="7E5593AF" wp14:editId="388CCCA1">
+            <wp:extent cx="7009447" cy="2320433"/>
+            <wp:effectExtent l="1270" t="0" r="2540" b="2540"/>
+            <wp:docPr id="1320763803" name="Picture 5"/>
+            <wp:cNvGraphicFramePr>
+              <a:graphicFrameLocks xmlns:a="http://schemas.openxmlformats.org/drawingml/2006/main" noChangeAspect="1"/>
+            </wp:cNvGraphicFramePr>
+            <a:graphic xmlns:a="http://schemas.openxmlformats.org/drawingml/2006/main">
+              <a:graphicData uri="http://schemas.openxmlformats.org/drawingml/2006/picture">
+                <pic:pic xmlns:pic="http://schemas.openxmlformats.org/drawingml/2006/picture">
+                  <pic:nvPicPr>
+                    <pic:cNvPr id="1320763803" name="Picture 1320763803"/>
+                    <pic:cNvPicPr/>
+                  </pic:nvPicPr>
+                  <pic:blipFill>
+                    <a:blip r:embed="rId8" cstate="print">
+                      <a:extLst>
+                        <a:ext uri="{28A0092B-C50C-407E-A947-70E740481C1C}">
+                          <a14:useLocalDpi xmlns:a14="http://schemas.microsoft.com/office/drawing/2010/main" val="0"/>
+                        </a:ext>
+                      </a:extLst>
+                    </a:blip>
+                    <a:stretch>
+                      <a:fillRect/>
+                    </a:stretch>
+                  </pic:blipFill>
+                  <pic:spPr>
+                    <a:xfrm rot="16200000">
+                      <a:off x="0" y="0"/>
+                      <a:ext cx="7122681" cy="2357918"/>
+                    </a:xfrm>
+                    <a:prstGeom prst="rect">
+                      <a:avLst/>
+                    </a:prstGeom>
+                  </pic:spPr>
+                </pic:pic>
+              </a:graphicData>
+            </a:graphic>
+          </wp:inline>
+        </w:drawing>
+      </w:r>
+    </w:p>
+    <w:p>
+      <w:r>
+        <w:t>2.4</w:t>
+      </w:r>
+      <w:r>
+        <w:t xml:space="preserve"> </w:t>
+      </w:r>
+      <w:r>
+        <w:t xml:space="preserve">Each </w:t>
+      </w:r>
+      <w:proofErr w:type="spellStart"/>
+      <w:r>
+        <w:t>FestivalGroup</w:t>
+      </w:r>
+      <w:proofErr w:type="spellEnd"/>
+      <w:r>
+        <w:t xml:space="preserve"> owns its </w:t>
+      </w:r>
+      <w:proofErr w:type="spellStart"/>
+      <w:r>
+        <w:t>FestivalComponent</w:t>
+      </w:r>
+      <w:proofErr w:type="spellEnd"/>
+      <w:r>
+        <w:t xml:space="preserve"> children. The root </w:t>
+      </w:r>
+      <w:proofErr w:type="spellStart"/>
+      <w:r>
+        <w:t>SonicHorizonsFestival</w:t>
+      </w:r>
+      <w:proofErr w:type="spellEnd"/>
+      <w:r>
+        <w:t xml:space="preserve"> therefore owns the complete festival hierarchy through its child groups.</w:t>
+      </w:r>
+      <w:r>
+        <w:t xml:space="preserve"> </w:t>
+      </w:r>
+      <w:r>
+        <w:t xml:space="preserve">When the root is destroyed, its destructor deletes its children. If a child is another </w:t>
+      </w:r>
+      <w:proofErr w:type="spellStart"/>
+      <w:r>
+        <w:t>FestivalGroup</w:t>
+      </w:r>
+      <w:proofErr w:type="spellEnd"/>
+      <w:r>
+        <w:t xml:space="preserve">, its destructor also deletes its children. This continues </w:t>
+      </w:r>
+      <w:r>
+        <w:lastRenderedPageBreak/>
+        <w:t>recursively until all leaves are destroyed. Since each component has only one owner, every object is deleted exactly once.</w:t>
+      </w:r>
+      <w:r>
+        <w:t xml:space="preserve"> </w:t>
+      </w:r>
+      <w:r>
+        <w:t xml:space="preserve">If a component is transferred between groups, </w:t>
+      </w:r>
+      <w:proofErr w:type="gramStart"/>
+      <w:r>
+        <w:t>remove(</w:t>
+      </w:r>
+      <w:proofErr w:type="gramEnd"/>
+      <w:r>
+        <w:t xml:space="preserve">) removes it from the original group without deleting it and returns the pointer. The new group then takes ownership when </w:t>
+      </w:r>
+      <w:proofErr w:type="gramStart"/>
+      <w:r>
+        <w:t>add(</w:t>
+      </w:r>
+      <w:proofErr w:type="gramEnd"/>
+      <w:r>
+        <w:t>) is called. This prevents memory leaks and double deletion during transfers.</w:t>
+      </w:r>
+    </w:p>
+    <w:p/>
     <w:p>
       <w:pPr>
         <w:pStyle w:val="ListParagraph"/>

</xml_diff>